<commit_message>
docs: sync Word course paper with PDF
Why: user requested the Word version to match the updated PDF and include the same project information.

Why this works: updates the DOCX title block and core metadata with author, student ID, GitHub repository, and GitHub Pages documentation link.

Validation: unzip -t code/course_paper.docx reported no errors; XML content check confirmed author 曹博雄, student ID 2023102959, repository URL, Pages URL, and metadata fields; curl confirmed the Pages URL returns HTTP 200.
</commit_message>
<xml_diff>
--- a/code/course_paper.docx
+++ b/code/course_paper.docx
@@ -1,6 +1,6 @@
 
 <file path=word/document.xml><?xml version="1.0" encoding="utf-8"?>
-<w:document xmlns:w="http://schemas.openxmlformats.org/wordprocessingml/2006/main" xmlns:r="http://schemas.openxmlformats.org/officeDocument/2006/relationships">
+<w:document xmlns:w="http://schemas.openxmlformats.org/wordprocessingml/2006/main">
   <w:body>
     <w:p>
       <w:pPr>
@@ -47,7 +47,37 @@
           <w:sz w:val="18"/>
           <w:szCs w:val="18"/>
         </w:rPr>
-        <w:t xml:space="preserve">作者：____________    学号：____________    日期：2026 年 7 月</w:t>
+        <w:t xml:space="preserve">作者：曹博雄    学号：2023102959    日期：2026 年 7 月</w:t>
+      </w:r>
+    </w:p>
+    <w:p>
+      <w:pPr>
+        <w:pStyle w:val="Meta"/>
+        <w:jc w:val="center"/>
+        <w:spacing w:after="80"/>
+      </w:pPr>
+      <w:r>
+        <w:rPr>
+          <w:rFonts w:ascii="Times New Roman" w:hAnsi="Times New Roman" w:eastAsia="SimSun" w:cs="Times New Roman"/>
+          <w:sz w:val="18"/>
+          <w:szCs w:val="18"/>
+        </w:rPr>
+        <w:t xml:space="preserve">项目仓库：https://github.com/CBx-2023/linux-select-chatroom</w:t>
+      </w:r>
+    </w:p>
+    <w:p>
+      <w:pPr>
+        <w:pStyle w:val="Meta"/>
+        <w:jc w:val="center"/>
+        <w:spacing w:after="80"/>
+      </w:pPr>
+      <w:r>
+        <w:rPr>
+          <w:rFonts w:ascii="Times New Roman" w:hAnsi="Times New Roman" w:eastAsia="SimSun" w:cs="Times New Roman"/>
+          <w:sz w:val="18"/>
+          <w:szCs w:val="18"/>
+        </w:rPr>
+        <w:t xml:space="preserve">GitHub Pages 文档：https://cbx-2023.github.io/linux-select-chatroom/</w:t>
       </w:r>
     </w:p>
     <w:p>

</xml_diff>